<commit_message>
Add verified doctor roster guidance to DOCX
</commit_message>
<xml_diff>
--- a/docs/exotel-carestack-agent-training.docx
+++ b/docs/exotel-carestack-agent-training.docx
@@ -95,6 +95,46 @@
         <w:pStyle w:val="Heading1"/>
       </w:pPr>
       <w:r>
+        <w:t xml:space="preserve">Clinic doctor list</w:t>
+      </w:r>
+    </w:p>
+    <w:p>
+      <w:pPr>
+        <w:pStyle w:val="ListBullet"/>
+      </w:pPr>
+      <w:r>
+        <w:t xml:space="preserve">•  The approved doctor roster is the doctors array returned by a live carestack call with action clinic_info. When a caller asks which doctors are at the clinic, call clinic_info during that turn before answering.</w:t>
+      </w:r>
+    </w:p>
+    <w:p>
+      <w:pPr>
+        <w:pStyle w:val="ListBullet"/>
+      </w:pPr>
+      <w:r>
+        <w:t xml:space="preserve">•  Name only doctors present in that live result. Do not answer from memory, prior turns, examples, appointment history, or guessed names. Do not invent, translate, autocomplete, or substitute a doctor name.</w:t>
+      </w:r>
+    </w:p>
+    <w:p>
+      <w:pPr>
+        <w:pStyle w:val="ListBullet"/>
+      </w:pPr>
+      <w:r>
+        <w:t xml:space="preserve">•  If the tool fails or returns an empty doctors array, say you cannot verify the clinic doctor list and offer to connect the caller with clinic staff. Do not list alternatives.</w:t>
+      </w:r>
+    </w:p>
+    <w:p>
+      <w:pPr>
+        <w:pStyle w:val="ListBullet"/>
+      </w:pPr>
+      <w:r>
+        <w:t xml:space="preserve">•  The current integration has no external CareStack doctor-directory sync. The clinic roster must be verified and saved in clinic configuration; old appointment records are not an authoritative doctor list.</w:t>
+      </w:r>
+    </w:p>
+    <w:p>
+      <w:pPr>
+        <w:pStyle w:val="Heading1"/>
+      </w:pPr>
+      <w:r>
         <w:t xml:space="preserve">Understand Indian dates and times</w:t>
       </w:r>
     </w:p>
@@ -520,6 +560,14 @@
       </w:pPr>
       <w:r>
         <w:t xml:space="preserve">Training text guides the conversation; it does not configure the Exotel API request. The backend can read recognized fields from the request itself or common JSON wrappers such as arguments, parameters, input, and payload; it can also read a list of {name, value} parameters. It can infer only a read-only availability action when both date and time arrive and no booking fields are present. It never infers a booking. An empty body has no information from which to determine an action or appointment time.</w:t>
+      </w:r>
+    </w:p>
+    <w:p>
+      <w:pPr>
+        <w:pStyle w:val="Normal"/>
+      </w:pPr>
+      <w:r>
+        <w:t xml:space="preserve">The carestack tool must be attached to the calling agent and accept action clinic_info so the agent can answer doctor-list questions from the live doctors array. Update the Exotel main Behavior prompt with the Clinic doctor list rules above and save/roll out the agent. Updating this training document alone does not change the prompt or configuration stored in Exotel.</w:t>
       </w:r>
     </w:p>
     <w:p>

</xml_diff>